<commit_message>
fix: update documentation formatting and clean up unnecessary whitespace
</commit_message>
<xml_diff>
--- a/Documentation/Front_Page.docx
+++ b/Documentation/Front_Page.docx
@@ -142,9 +142,16 @@
     <w:p>
       <w:pPr>
         <w:spacing w:after="249"/>
-        <w:ind w:left="2292" w:right="391"/>
+        <w:ind w:left="720" w:right="391" w:firstLine="720"/>
         <w:jc w:val="both"/>
       </w:pPr>
+      <w:r>
+        <w:rPr>
+          <w:rFonts w:ascii="Times New Roman" w:eastAsia="Times New Roman" w:hAnsi="Times New Roman" w:cs="Times New Roman"/>
+          <w:sz w:val="24"/>
+        </w:rPr>
+        <w:t xml:space="preserve">  </w:t>
+      </w:r>
       <w:r>
         <w:rPr>
           <w:rFonts w:ascii="Times New Roman" w:eastAsia="Times New Roman" w:hAnsi="Times New Roman" w:cs="Times New Roman"/>
@@ -2013,14 +2020,6 @@
           <w:szCs w:val="28"/>
         </w:rPr>
         <w:t xml:space="preserve">, under the guidance of </w:t>
-      </w:r>
-      <w:r>
-        <w:rPr>
-          <w:rFonts w:ascii="Times New Roman" w:eastAsia="Times New Roman" w:hAnsi="Times New Roman" w:cs="Times New Roman"/>
-          <w:sz w:val="28"/>
-          <w:szCs w:val="28"/>
-        </w:rPr>
-        <w:t xml:space="preserve"> </w:t>
       </w:r>
       <w:r>
         <w:rPr>

</xml_diff>